<commit_message>
docs(install): correct IC-705 USB port — micro-USB, not USB-C
The factory IC-705 has a micro-USB (Type-B micro) port; Icom never shipped USB-C
on it. Corrected the cable table, the plug-in steps, the computer-side-sockets
note, and the CI-V chapter's IC-705 note (USB-A-to-micro-USB cable, [USB] micro
socket on the side). Added a note that some owners fit an aftermarket USB-C board
mod, in which case a USB-C cable is used instead. Verified against Icom's spec.

Co-Authored-By: Claude Opus 4.8 <noreply@anthropic.com>
</commit_message>
<xml_diff>
--- a/docs/published/IcomRigControl_Installation_Guide.docx
+++ b/docs/published/IcomRigControl_Installation_Guide.docx
@@ -1142,10 +1142,10 @@
         <w:rPr>
           <w:b/>
         </w:rPr>
-        <w:t>USB-A-to-USB-C</w:t>
-      </w:r>
-      <w:r>
-        <w:t xml:space="preserve"> cable. The exact cable and where it plugs in are covered in the 'Connecting Your Radio Over USB' chapter.</w:t>
+        <w:t>USB-A-to-micro-USB</w:t>
+      </w:r>
+      <w:r>
+        <w:t xml:space="preserve"> cable (the small micro-USB plug goes into the radio). The exact cable and where it plugs in are covered in the 'Connecting Your Radio Over USB' chapter.</w:t>
       </w:r>
     </w:p>
     <w:p>
@@ -5890,7 +5890,7 @@
               <w:rPr>
                 <w:sz w:val="19"/>
               </w:rPr>
-              <w:t>USB-A to USB-C</w:t>
+              <w:t>USB-A to micro-USB</w:t>
             </w:r>
           </w:p>
         </w:tc>
@@ -5913,7 +5913,7 @@
               <w:rPr>
                 <w:sz w:val="19"/>
               </w:rPr>
-              <w:t>The flat rectangular plug (USB-A) goes into the computer; the small oval reversible plug (USB-C) goes into the radio.</w:t>
+              <w:t>The flat rectangular plug (USB-A) goes into the computer; the small micro-USB plug goes into the radio's [USB] port.</w:t>
             </w:r>
           </w:p>
         </w:tc>
@@ -5991,7 +5991,7 @@
                 <w:b/>
                 <w:color w:val="222B38"/>
               </w:rPr>
-              <w:t>USB-C to USB-C</w:t>
+              <w:t>USB-C to micro-USB</w:t>
             </w:r>
             <w:r>
               <w:rPr>
@@ -6280,16 +6280,25 @@
         <w:t>side</w:t>
       </w:r>
       <w:r>
-        <w:t xml:space="preserve"> of the IC-705, behind the rubber cover, find the oval </w:t>
+        <w:t xml:space="preserve"> of the IC-705, behind the rubber cover, find the small </w:t>
       </w:r>
       <w:r>
         <w:rPr>
           <w:b/>
         </w:rPr>
-        <w:t>USB-C</w:t>
-      </w:r>
-      <w:r>
-        <w:t xml:space="preserve"> socket (marked with the USB symbol; it sits near the DC-power and headphone jacks). Plug the USB-C end of your cable in there, and the other end into your computer.</w:t>
+        <w:t>micro-USB</w:t>
+      </w:r>
+      <w:r>
+        <w:t xml:space="preserve"> socket labeled </w:t>
+      </w:r>
+      <w:r>
+        <w:rPr>
+          <w:b/>
+        </w:rPr>
+        <w:t>[USB]</w:t>
+      </w:r>
+      <w:r>
+        <w:t xml:space="preserve"> (it sits among the DC-power, microphone, and headphone jacks). Plug the micro-USB end of your cable in there, and the other end into your computer. The micro-USB plug only goes in one way — the wider side of the little plug faces down; do not force it.</w:t>
       </w:r>
     </w:p>
     <w:tbl>
@@ -6348,7 +6357,7 @@
                 <w:color w:val="64748B"/>
                 <w:sz w:val="20"/>
               </w:rPr>
-              <w:t>The side of the IC-705 with the rubber port cover open, the USB-C socket circled and labeled, and a USB-C cable plugged in</w:t>
+              <w:t>The side of the IC-705 with the rubber port cover open, the micro-USB [USB] socket circled and labeled, and a micro-USB cable plugged in</w:t>
             </w:r>
           </w:p>
         </w:tc>
@@ -6400,13 +6409,110 @@
                 <w:color w:val="1F3A5F"/>
                 <w:sz w:val="21"/>
               </w:rPr>
-              <w:t xml:space="preserve">The IC-705 also charges over USB-C.   </w:t>
+              <w:t xml:space="preserve">The IC-705 also charges over this port.   </w:t>
             </w:r>
             <w:r>
               <w:rPr>
                 <w:color w:val="222B38"/>
               </w:rPr>
-              <w:t>The USB-C port can also power and charge the radio. For steady control and operating, run the IC-705 from its own DC power or a well-charged battery — do not rely on the computer's USB port alone to keep it running while you operate.</w:t>
+              <w:t>The micro-USB port can also power and charge the radio. For steady control and operating, run the IC-705 from its own DC power or a well-charged battery — do not rely on the computer's USB port alone to keep it running while you operate.</w:t>
+            </w:r>
+          </w:p>
+        </w:tc>
+      </w:tr>
+    </w:tbl>
+    <w:p>
+      <w:pPr>
+        <w:spacing w:after="80"/>
+      </w:pPr>
+    </w:p>
+    <w:tbl>
+      <w:tblPr>
+        <w:tblW w:type="auto" w:w="0"/>
+        <w:jc w:val="center"/>
+        <w:tblLayout w:type="fixed"/>
+        <w:tblLook w:firstColumn="1" w:firstRow="1" w:lastColumn="0" w:lastRow="0" w:noHBand="0" w:noVBand="1" w:val="04A0"/>
+      </w:tblPr>
+      <w:tblGrid>
+        <w:gridCol w:w="9360"/>
+      </w:tblGrid>
+      <w:tr>
+        <w:trPr>
+          <w:cantSplit/>
+        </w:trPr>
+        <w:tc>
+          <w:tcPr>
+            <w:tcW w:type="dxa" w:w="9360"/>
+            <w:shd w:val="clear" w:color="auto" w:fill="E7F0FA"/>
+            <w:tcBorders>
+              <w:top w:val="single" w:sz="4" w:space="0" w:color="2E6DA4"/>
+              <w:left w:val="single" w:sz="30" w:space="0" w:color="2E6DA4"/>
+              <w:bottom w:val="single" w:sz="4" w:space="0" w:color="2E6DA4"/>
+              <w:right w:val="single" w:sz="4" w:space="0" w:color="2E6DA4"/>
+            </w:tcBorders>
+            <w:tcMar>
+              <w:top w:w="110" w:type="dxa"/>
+              <w:start w:w="170" w:type="dxa"/>
+              <w:bottom w:w="110" w:type="dxa"/>
+              <w:end w:w="170" w:type="dxa"/>
+            </w:tcMar>
+          </w:tcPr>
+          <w:p>
+            <w:pPr>
+              <w:spacing w:after="0"/>
+            </w:pPr>
+            <w:r>
+              <w:rPr>
+                <w:b/>
+                <w:color w:val="1F3A5F"/>
+                <w:sz w:val="21"/>
+              </w:rPr>
+              <w:t xml:space="preserve">If your IC-705 has been modified to USB-C.   </w:t>
+            </w:r>
+            <w:r>
+              <w:rPr>
+                <w:color w:val="222B38"/>
+              </w:rPr>
+              <w:t xml:space="preserve">Every IC-705 leaves the factory with a </w:t>
+            </w:r>
+            <w:r>
+              <w:rPr>
+                <w:b/>
+                <w:color w:val="222B38"/>
+              </w:rPr>
+              <w:t>micro-USB</w:t>
+            </w:r>
+            <w:r>
+              <w:rPr>
+                <w:color w:val="222B38"/>
+              </w:rPr>
+              <w:t xml:space="preserve"> port. Some owners fit an aftermarket board that replaces it with a </w:t>
+            </w:r>
+            <w:r>
+              <w:rPr>
+                <w:b/>
+                <w:color w:val="222B38"/>
+              </w:rPr>
+              <w:t>USB-C</w:t>
+            </w:r>
+            <w:r>
+              <w:rPr>
+                <w:color w:val="222B38"/>
+              </w:rPr>
+              <w:t xml:space="preserve"> socket. If yours has been modified that way, simply use a </w:t>
+            </w:r>
+            <w:r>
+              <w:rPr>
+                <w:b/>
+                <w:color w:val="222B38"/>
+              </w:rPr>
+              <w:t>USB-A-to-USB-C</w:t>
+            </w:r>
+            <w:r>
+              <w:rPr>
+                <w:color w:val="222B38"/>
+              </w:rPr>
+              <w:t xml:space="preserve"> (or USB-C-to-USB-C) cable instead — everything else in this guide is exactly the same.</w:t>
             </w:r>
           </w:p>
         </w:tc>
@@ -10142,7 +10248,7 @@
               <w:rPr>
                 <w:color w:val="222B38"/>
               </w:rPr>
-              <w:t>The IC-705 can also do CI-V over Bluetooth, but IcomRigControl connects over the USB-C cable, which carries both control and audio. Use the USB cable; you do not need to set up Bluetooth.</w:t>
+              <w:t>The IC-705 can also do CI-V over Bluetooth, but IcomRigControl connects over the USB cable, which carries both control and audio. Use the USB cable; you do not need to set up Bluetooth.</w:t>
             </w:r>
           </w:p>
         </w:tc>

</xml_diff>